<commit_message>
fix: restore cover rules; generate figure/table lists with page refs; release 0.4.6
</commit_message>
<xml_diff>
--- a/plugin/template/GY-F003-cleaned.docx
+++ b/plugin/template/GY-F003-cleaned.docx
@@ -165,6 +165,68 @@
           <w:rFonts w:hint="eastAsia" w:ascii="宋体" w:hAnsi="宋体" w:eastAsia="宋体" w:cs="宋体"/>
         </w:rPr>
       </w:r>
+      <w:r>
+        <w:rPr>
+          <w:rFonts w:hint="eastAsia" w:ascii="宋体" w:hAnsi="宋体" w:eastAsia="宋体" w:cs="宋体"/>
+        </w:rPr>
+        <mc:AlternateContent>
+          <mc:Choice Requires="wps">
+            <w:drawing>
+              <wp:anchor distT="0" distB="0" distL="114300" distR="114300" simplePos="0" relativeHeight="251660288" behindDoc="0" locked="0" layoutInCell="1" allowOverlap="1">
+                <wp:simplePos x="0" y="0"/>
+                <wp:positionH relativeFrom="column">
+                  <wp:posOffset>0</wp:posOffset>
+                </wp:positionH>
+                <wp:positionV relativeFrom="margin">
+                  <wp:posOffset>1259840</wp:posOffset>
+                </wp:positionV>
+                <wp:extent cx="5266690" cy="3810"/>
+                <wp:effectExtent l="0" t="9525" r="635" b="15240"/>
+                <wp:wrapNone/>
+                <wp:docPr id="10" name="直接连接符 1"/>
+                <wp:cNvGraphicFramePr/>
+                <a:graphic xmlns:a="http://schemas.openxmlformats.org/drawingml/2006/main">
+                  <a:graphicData uri="http://schemas.microsoft.com/office/word/2010/wordprocessingShape">
+                    <wps:wsp>
+                      <wps:cNvCnPr>
+                        <a:cxnSpLocks noChangeShapeType="1"/>
+                      </wps:cNvCnPr>
+                      <wps:spPr bwMode="auto">
+                        <a:xfrm flipV="1">
+                          <a:off x="0" y="0"/>
+                          <a:ext cx="5266690" cy="3810"/>
+                        </a:xfrm>
+                        <a:prstGeom prst="line">
+                          <a:avLst/>
+                        </a:prstGeom>
+                        <a:noFill/>
+                        <a:ln w="19050">
+                          <a:solidFill>
+                            <a:srgbClr val="000000"/>
+                          </a:solidFill>
+                          <a:round/>
+                        </a:ln>
+                        <a:effectLst/>
+                      </wps:spPr>
+                      <wps:bodyPr/>
+                    </wps:wsp>
+                  </a:graphicData>
+                </a:graphic>
+              </wp:anchor>
+            </w:drawing>
+          </mc:Choice>
+          <mc:Fallback>
+            <w:pict>
+              <v:line id="直接连接符 1" o:spid="_x0000_s1026" o:spt="20" style="position:absolute;left:0pt;flip:y;margin-left:0pt;margin-top:99.2pt;height:0.3pt;width:414.7pt;mso-position-vertical-relative:margin;z-index:251660288;mso-width-relative:page;mso-height-relative:page;" filled="f" stroked="t" coordsize="21600,21600" o:gfxdata="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">
+                <v:fill on="f" focussize="0,0"/>
+                <v:stroke weight="1.5pt" color="#000000" joinstyle="round"/>
+                <v:imagedata o:title=""/>
+                <o:lock v:ext="edit" aspectratio="f"/>
+              </v:line>
+            </w:pict>
+          </mc:Fallback>
+        </mc:AlternateContent>
+      </w:r>
     </w:p>
     <w:p>
       <w:pPr>
@@ -1651,6 +1713,66 @@
       <w:bookmarkEnd w:id="0"/>
       <w:bookmarkEnd w:id="1"/>
       <w:bookmarkEnd w:id="2"/>
+      <w:r>
+        <w:rPr>
+          <w:rFonts w:hint="eastAsia" w:ascii="宋体" w:hAnsi="宋体" w:eastAsia="宋体" w:cs="宋体"/>
+          <w:b/>
+          <w:bCs/>
+          <w:sz w:val="30"/>
+          <w:szCs w:val="30"/>
+        </w:rPr>
+        <mc:AlternateContent>
+          <mc:Choice Requires="wps">
+            <w:drawing>
+              <wp:inline distT="0" distB="0" distL="114300" distR="114300">
+                <wp:extent cx="5266690" cy="635"/>
+                <wp:effectExtent l="0" t="9525" r="635" b="18415"/>
+                <wp:docPr id="28" name="直接连接符 2"/>
+                <wp:cNvGraphicFramePr/>
+                <a:graphic xmlns:a="http://schemas.openxmlformats.org/drawingml/2006/main">
+                  <a:graphicData uri="http://schemas.microsoft.com/office/word/2010/wordprocessingShape">
+                    <wps:wsp>
+                      <wps:cNvCnPr>
+                        <a:cxnSpLocks noChangeShapeType="1"/>
+                      </wps:cNvCnPr>
+                      <wps:spPr bwMode="auto">
+                        <a:xfrm>
+                          <a:off x="0" y="0"/>
+                          <a:ext cx="5266690" cy="0"/>
+                        </a:xfrm>
+                        <a:prstGeom prst="line">
+                          <a:avLst/>
+                        </a:prstGeom>
+                        <a:noFill/>
+                        <a:ln w="19050">
+                          <a:solidFill>
+                            <a:srgbClr val="000000"/>
+                          </a:solidFill>
+                          <a:round/>
+                        </a:ln>
+                        <a:effectLst/>
+                      </wps:spPr>
+                      <wps:bodyPr/>
+                    </wps:wsp>
+                  </a:graphicData>
+                </a:graphic>
+              </wp:inline>
+            </w:drawing>
+          </mc:Choice>
+          <mc:Fallback>
+            <w:pict>
+              <v:line id="直接连接符 2" o:spid="_x0000_s1026" o:spt="20" style="height:0.05pt;width:414.7pt;" filled="f" stroked="t" coordsize="21600,21600" o:gfxdata="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">
+                <v:fill on="f" focussize="0,0"/>
+                <v:stroke weight="1.5pt" color="#000000" joinstyle="round"/>
+                <v:imagedata o:title=""/>
+                <o:lock v:ext="edit" aspectratio="f"/>
+                <w10:wrap type="none"/>
+                <w10:anchorlock/>
+              </v:line>
+            </w:pict>
+          </mc:Fallback>
+        </mc:AlternateContent>
+      </w:r>
     </w:p>
     <w:p>
       <w:pPr>
@@ -4196,7 +4318,7 @@
           <w:szCs w:val="24"/>
           <w:lang w:val="en-US" w:eastAsia="zh-CN" w:bidi="he-IL"/>
         </w:rPr>
-        <w:instrText xml:space="preserve">TOC \h \c "图"</w:instrText>
+        <w:instrText xml:space="preserve"> TOC \h \c "图" </w:instrText>
       </w:r>
       <w:r>
         <w:rPr>
@@ -4223,7 +4345,7 @@
           <w:szCs w:val="24"/>
           <w:lang w:val="en-US" w:eastAsia="zh-CN" w:bidi="he-IL"/>
         </w:rPr>
-        <w:instrText xml:space="preserve"> HYPERLINK \l _Toc2025 </w:instrText>
+        <w:instrText xml:space="preserve"/>
       </w:r>
       <w:r>
         <w:rPr>
@@ -4265,7 +4387,7 @@
         <w:fldChar w:fldCharType="begin"/>
       </w:r>
       <w:r>
-        <w:instrText xml:space="preserve"> PAGEREF _Toc2025 \h </w:instrText>
+        <w:instrText xml:space="preserve"/>
       </w:r>
       <w:r>
         <w:fldChar w:fldCharType="separate"/>
@@ -4428,7 +4550,7 @@
           <w:szCs w:val="24"/>
           <w:lang w:val="en-US" w:eastAsia="zh-CN" w:bidi="he-IL"/>
         </w:rPr>
-        <w:instrText xml:space="preserve">TOC \h \c "表"</w:instrText>
+        <w:instrText xml:space="preserve"> TOC \h \c "表" </w:instrText>
       </w:r>
       <w:r>
         <w:rPr>
@@ -4456,7 +4578,7 @@
           <w:szCs w:val="24"/>
           <w:lang w:val="en-US" w:eastAsia="zh-CN" w:bidi="he-IL"/>
         </w:rPr>
-        <w:instrText xml:space="preserve"> HYPERLINK \l _Toc10726 </w:instrText>
+        <w:instrText xml:space="preserve"/>
       </w:r>
       <w:r>
         <w:rPr>
@@ -4498,7 +4620,7 @@
         <w:fldChar w:fldCharType="begin"/>
       </w:r>
       <w:r>
-        <w:instrText xml:space="preserve"> PAGEREF _Toc10726 \h </w:instrText>
+        <w:instrText xml:space="preserve"/>
       </w:r>
       <w:r>
         <w:fldChar w:fldCharType="separate"/>
@@ -11163,6 +11285,14 @@
       <w:lang w:bidi="he-IL"/>
     </w:rPr>
   </w:style>
+  <w:style w:type="paragraph" w:customStyle="1" w:styleId="图题注">
+    <w:name w:val="图题注"/>
+    <w:basedOn w:val="11"/>
+  </w:style>
+  <w:style w:type="paragraph" w:customStyle="1" w:styleId="表题注">
+    <w:name w:val="表题注"/>
+    <w:basedOn w:val="11"/>
+  </w:style>
 </w:styles>
 </file>
 

</xml_diff>